<commit_message>
Add narrative findings and arithmetic-analysis sections
The findings chapter now closes with a six-paragraph verbal
description of the results per domain, and the arithmetic analysis
gains a narrative synthesis explaining the uneven profile and the
rationale for centering the intervention on regrouping.

Co-Authored-By: Claude Fable 5 <noreply@anthropic.com>
Claude-Session: https://claude.ai/code/session_01EMxFUHHVvpa8bYzfYkV3bj
</commit_message>
<xml_diff>
--- a/lesson-plan/מיפוי-תוכנית-עבודה-וממצאים.docx
+++ b/lesson-plan/מיפוי-תוכנית-עבודה-וממצאים.docx
@@ -5879,6 +5879,107 @@
       </w:tr>
     </w:tbl>
     <w:p>
+      <w:pPr>
+        <w:bidi/>
+        <w:spacing w:after="100" w:before="200"/>
+      </w:pPr>
+      <w:r>
+        <w:rPr>
+          <w:rFonts w:ascii="David" w:cs="David" w:eastAsia="David" w:hAnsi="David"/>
+          <w:b/>
+          <w:bCs/>
+          <w:sz w:val="24"/>
+          <w:szCs w:val="24"/>
+          <w:rtl/>
+        </w:rPr>
+        <w:t xml:space="preserve">תיאור הממצאים במלל</w:t>
+      </w:r>
+    </w:p>
+    <w:p>
+      <w:pPr>
+        <w:bidi/>
+        <w:spacing w:after="120" w:before="0"/>
+        <w:jc w:val="right"/>
+      </w:pPr>
+      <w:r>
+        <w:rPr>
+          <w:rFonts w:ascii="David" w:cs="David" w:eastAsia="David" w:hAnsi="David"/>
+          <w:rtl/>
+        </w:rPr>
+        <w:t xml:space="preserve">תפיסה כמותית ותבניות: תחום חזק ויציב. יובל מזהה תבניות ליי וקובייה בשליפה מהירה וללא מנייה, ומסביר את דרך הזיהוי שלו ("ראיתי 5 ולידו עוד 3"). פירוק והרכבה של כמויות בתחום ה-10 מבוצעים ברובם בשליפה, ורק בצירופים הקשים (6 ו-8) הוא נעזר באצבעות. זהו בסיס איתן שההוראה תישען עליו.</w:t>
+      </w:r>
+    </w:p>
+    <w:p>
+      <w:pPr>
+        <w:bidi/>
+        <w:spacing w:after="120" w:before="0"/>
+        <w:jc w:val="right"/>
+      </w:pPr>
+      <w:r>
+        <w:rPr>
+          <w:rFonts w:ascii="David" w:cs="David" w:eastAsia="David" w:hAnsi="David"/>
+          <w:rtl/>
+        </w:rPr>
+        <w:t xml:space="preserve">עובדות ושבירת עשרת: בעובדות היסוד בתחום ה-10 השליטה טובה, ותרגילי 1+, 1-, תאומים וחיבור אפס נשלפים במהירות. התמונה משתנה בשבירת העשרת: שם יובל חוזר למנייה באצבעות, איטי וטועה באופן עקבי (12=5+8, 16=9+6). אסטרטגיות יעילות, ובראשן ההשלמה לעשר וההישענות על תאומים, אינן מופיעות כלל.</w:t>
+      </w:r>
+    </w:p>
+    <w:p>
+      <w:pPr>
+        <w:bidi/>
+        <w:spacing w:after="120" w:before="0"/>
+        <w:jc w:val="right"/>
+      </w:pPr>
+      <w:r>
+        <w:rPr>
+          <w:rFonts w:ascii="David" w:cs="David" w:eastAsia="David" w:hAnsi="David"/>
+          <w:rtl/>
+        </w:rPr>
+        <w:t xml:space="preserve">מבנה עשרוני, המרה ופריטה: נקודת השבר המרכזית של המיפוי. יובל קורא וכותב מספרים דו-ספרתיים, אך ההבנה הפוזיציונית שברירית: הוא מהסס בהשוואת 17 ו-71 ומנמק הנמקה שגויה, ואת "מאה ושלוש" הוא כותב 1003. בהמרה ובפריטה אין שליטה: הוא אינו יודע ש-10 אחדות שוות עשרת אחת, עונה "4" על "כמה אחדות ב-1 עשרת ו-3 אחדות", ומזהה ב-25 חמש אחדות בלבד. הייצוג הכספי נגיש לו יותר מן הסמלי: על שאלות ההחלפה במטבעות השיב נכון.</w:t>
+      </w:r>
+    </w:p>
+    <w:p>
+      <w:pPr>
+        <w:bidi/>
+        <w:spacing w:after="120" w:before="0"/>
+        <w:jc w:val="right"/>
+      </w:pPr>
+      <w:r>
+        <w:rPr>
+          <w:rFonts w:ascii="David" w:cs="David" w:eastAsia="David" w:hAnsi="David"/>
+          <w:rtl/>
+        </w:rPr>
+        <w:t xml:space="preserve">טכניקות חישוב: במאונך נמצאו שתי טעויות שיטתיות מובהקות. בחיבור עם המרה נכתבות שתי ספרות הסכום בטור האחדות (712=57+25), ובחיסור עם פריטה מחוסרת תמיד הספרה הקטנה מן הגדולה (24=43-27). שתי הטעויות חוזרות בכל התרגילים שנבדקו, והן תוצאה ישירה של היעדר ההמרה והפריטה ולא של אי-ידיעת האלגוריתם.</w:t>
+      </w:r>
+    </w:p>
+    <w:p>
+      <w:pPr>
+        <w:bidi/>
+        <w:spacing w:after="120" w:before="0"/>
+        <w:jc w:val="right"/>
+      </w:pPr>
+      <w:r>
+        <w:rPr>
+          <w:rFonts w:ascii="David" w:cs="David" w:eastAsia="David" w:hAnsi="David"/>
+          <w:rtl/>
+        </w:rPr>
+        <w:t xml:space="preserve">רצף, עיגול ואומדן: הרצף העולה תקין, אך הספירה לאחור איטית ומשתבשת במעברי עשרת. עיגול ואומדן כמעט אינם קיימים: יובל מנסה לחשב במדויק במקום לאמוד, וכשנדרש עיגול הוא בוחר את העשרת הלא נכונה.</w:t>
+      </w:r>
+    </w:p>
+    <w:p>
+      <w:pPr>
+        <w:bidi/>
+        <w:spacing w:after="120" w:before="0"/>
+        <w:jc w:val="right"/>
+      </w:pPr>
+      <w:r>
+        <w:rPr>
+          <w:rFonts w:ascii="David" w:cs="David" w:eastAsia="David" w:hAnsi="David"/>
+          <w:rtl/>
+        </w:rPr>
+        <w:t xml:space="preserve">כפל, חילוק ובעיות מילוליות: הנושאים בתחילת רכישתם, בהתאם לשלב הלימוד בכיתה. יובל מבין את שפת הקבוצות בעזרת תיווך ומבצע חילוק מוחשי, אך אינו מציב תרגיל ואינו שולף עובדות. בבעיות מילוליות הוא פותר בעיות פשוטות של הוספה והורדה, ומתקשה בבעיות השוואה, בבעיות עם נעלם בהתחלה ובבעיות דו-שלביות, שבהן הוא מבצע שלב אחד בלבד.</w:t>
+      </w:r>
+    </w:p>
+    <w:p>
       <w:r>
         <w:br w:type="page"/>
       </w:r>
@@ -19452,6 +19553,51 @@
           <w:rtl/>
         </w:rPr>
         <w:t xml:space="preserve">הערות ודגשים: הנושא בתחילת רכישתו בכיתה. הישענותו של הכפל על חיבור חוזר מחייבת ביסוס קודם של עובדות החיבור, ולכן הכפל אינו מוקד בתוכנית הנוכחית.</w:t>
+      </w:r>
+    </w:p>
+    <w:p>
+      <w:pPr>
+        <w:bidi/>
+        <w:spacing w:after="100" w:before="200"/>
+      </w:pPr>
+      <w:r>
+        <w:rPr>
+          <w:rFonts w:ascii="David" w:cs="David" w:eastAsia="David" w:hAnsi="David"/>
+          <w:b/>
+          <w:bCs/>
+          <w:sz w:val="24"/>
+          <w:szCs w:val="24"/>
+          <w:rtl/>
+        </w:rPr>
+        <w:t xml:space="preserve">ניתוח חשבוני במלל</w:t>
+      </w:r>
+    </w:p>
+    <w:p>
+      <w:pPr>
+        <w:bidi/>
+        <w:spacing w:after="120" w:before="0"/>
+        <w:jc w:val="right"/>
+      </w:pPr>
+      <w:r>
+        <w:rPr>
+          <w:rFonts w:ascii="David" w:cs="David" w:eastAsia="David" w:hAnsi="David"/>
+          <w:rtl/>
+        </w:rPr>
+        <w:t xml:space="preserve">פרופיל התפקוד החשבוני של יובל אינו אחיד, וזה עיקרו: תשתית התפיסה בעשרת הראשונה שלמה כמעט לגמרי (דירוגי 4), ואילו הבנת ההמרה והפריטה נעדרת (דירוג 1). בין שני הקצוות נמתחת שרשרת של מיומנויות שנפגעו בשל אותה חוליה חסרה: שליפת עובדות בשבירת עשרת (2), חיבור בתחום ה-100 עם המרה (1) וחיסור עם פריטה (1). לעומתן, מיומנויות שאינן תלויות בהמרה, ובהן חיבור וחיסור ללא המרה והבנת מהות הפעולות, מדורגות 3 ו-4.</w:t>
+      </w:r>
+    </w:p>
+    <w:p>
+      <w:pPr>
+        <w:bidi/>
+        <w:spacing w:after="120" w:before="0"/>
+        <w:jc w:val="right"/>
+      </w:pPr>
+      <w:r>
+        <w:rPr>
+          <w:rFonts w:ascii="David" w:cs="David" w:eastAsia="David" w:hAnsi="David"/>
+          <w:rtl/>
+        </w:rPr>
+        <w:t xml:space="preserve">מכאן שהקושי אינו רוחבי אלא ממוקד. אין מדובר בתלמיד "חלש בחשבון" באופן כללי, אלא בתלמיד עם פער נקודתי בהבנת המבנה העשרוני, שסביבו התפתחו דרכי עקיפה לא יעילות (מנייה באצבעות) וטעויות אלגוריתם שיטתיות. לפער יש גם מחיר רגשי מצטבר, שבא לידי ביטוי בהימנעות ובאמירות "אני לא טוב בחשבון". תוכנית ההתערבות ממקדת לכן את ההוראה בעקרון ההמרה, מתוך הנחה שביסוסו יפתח את השרשרת כולה, ומשלבת לכל אורכה עבודה על תחושת המסוגלות.</w:t>
       </w:r>
     </w:p>
     <w:p>

</xml_diff>

<commit_message>
Fix two typos and suppress spell-check squiggles
Correct the misspellings of "apply" and "fragile" in the mapping
document, and add three layers against red underlines in Word for both
files: noProof in the document run defaults, hideSpellingErrors and
hideGrammaticalErrors in settings, and a clean proof state.

Co-Authored-By: Claude Fable 5 <noreply@anthropic.com>
Claude-Session: https://claude.ai/code/session_01EMxFUHHVvpa8bYzfYkV3bj
</commit_message>
<xml_diff>
--- a/lesson-plan/מיפוי-תוכנית-עבודה-וממצאים.docx
+++ b/lesson-plan/מיפוי-תוכנית-עבודה-וממצאים.docx
@@ -5962,7 +5962,7 @@
           <w:rFonts w:ascii="David" w:cs="David" w:eastAsia="David" w:hAnsi="David"/>
           <w:rtl/>
         </w:rPr>
-        <w:t xml:space="preserve">מבנה עשרוני ופוזיציה: הידע הטכני קיים, ההבנה שבירית. יובל קורא וכותב מספרים דו-ספרתיים ומזהה ספרות אחדות ועשרות, אבל כשנדרש פירוש של המבנה הוא נחשף: את "מאה ושלוש" כתב 1003, כתיבה שמיעתית של המילים ללא הבנת ערך המקום; בשיום מקום הספרה 3 במספר 13 אמר "עשרות"; ובהשוואת 17 ו-71 ענה נכון אך נימק "כי 7 בא קודם", הנמקה חזותית שאינה נשענת על ערך המקום ותקרוס במספרים אחרים. לשאלות מסוג "מיהו המספר שיש לו שש עשרות ושלוש אחדות" ענה תחילה 36 ותיקן רק לאחר שאלה חוזרת.</w:t>
+        <w:t xml:space="preserve">מבנה עשרוני ופוזיציה: הידע הטכני קיים, ההבנה שברירית. יובל קורא וכותב מספרים דו-ספרתיים ומזהה ספרות אחדות ועשרות, אבל כשנדרש פירוש של המבנה הוא נחשף: את "מאה ושלוש" כתב 1003, כתיבה שמיעתית של המילים ללא הבנת ערך המקום; בשיום מקום הספרה 3 במספר 13 אמר "עשרות"; ובהשוואת 17 ו-71 ענה נכון אך נימק "כי 7 בא קודם", הנמקה חזותית שאינה נשענת על ערך המקום ותקרוס במספרים אחרים. לשאלות מסוג "מיהו המספר שיש לו שש עשרות ושלוש אחדות" ענה תחילה 36 ותיקן רק לאחר שאלה חוזרת.</w:t>
       </w:r>
     </w:p>
     <w:p>
@@ -20110,7 +20110,7 @@
           <w:szCs w:val="22"/>
           <w:rtl/>
         </w:rPr>
-        <w:t xml:space="preserve">5. התלמיד ייישם את הנלמד בבעיות מילוליות מחיי היומיום.</w:t>
+        <w:t xml:space="preserve">5. התלמיד יישם את הנלמד בבעיות מילוליות מחיי היומיום.</w:t>
       </w:r>
     </w:p>
     <w:p>
@@ -21790,6 +21790,7 @@
     <w:rPrDefault>
       <w:rPr>
         <w:rFonts w:ascii="David" w:cs="David" w:eastAsia="David" w:hAnsi="David"/>
+        <w:noProof/>
         <w:sz w:val="24"/>
         <w:szCs w:val="24"/>
         <w:rtl/>

</xml_diff>

<commit_message>
Justify body paragraphs in both submission files
Body text is now justified to both margins; headings stay centered and
table-cell text stays right-aligned, where full justification would
create ugly gaps in narrow cells.

Co-Authored-By: Claude Fable 5 <noreply@anthropic.com>
Claude-Session: https://claude.ai/code/session_01EMxFUHHVvpa8bYzfYkV3bj
</commit_message>
<xml_diff>
--- a/lesson-plan/מיפוי-תוכנית-עבודה-וממצאים.docx
+++ b/lesson-plan/מיפוי-תוכנית-עבודה-וממצאים.docx
@@ -246,7 +246,7 @@
       <w:pPr>
         <w:bidi/>
         <w:spacing w:after="120" w:before="0"/>
-        <w:jc w:val="right"/>
+        <w:jc w:val="both"/>
       </w:pPr>
       <w:r>
         <w:rPr>
@@ -260,7 +260,7 @@
       <w:pPr>
         <w:bidi/>
         <w:spacing w:after="120" w:before="0"/>
-        <w:jc w:val="right"/>
+        <w:jc w:val="both"/>
       </w:pPr>
       <w:r>
         <w:rPr>
@@ -274,7 +274,7 @@
       <w:pPr>
         <w:bidi/>
         <w:spacing w:after="120" w:before="0"/>
-        <w:jc w:val="right"/>
+        <w:jc w:val="both"/>
       </w:pPr>
       <w:r>
         <w:rPr>
@@ -288,7 +288,7 @@
       <w:pPr>
         <w:bidi/>
         <w:spacing w:after="120" w:before="0"/>
-        <w:jc w:val="right"/>
+        <w:jc w:val="both"/>
       </w:pPr>
       <w:r>
         <w:rPr>
@@ -302,7 +302,7 @@
       <w:pPr>
         <w:bidi/>
         <w:spacing w:after="120" w:before="0"/>
-        <w:jc w:val="right"/>
+        <w:jc w:val="both"/>
       </w:pPr>
       <w:r>
         <w:rPr>
@@ -316,7 +316,7 @@
       <w:pPr>
         <w:bidi/>
         <w:spacing w:after="120" w:before="0"/>
-        <w:jc w:val="right"/>
+        <w:jc w:val="both"/>
       </w:pPr>
       <w:r>
         <w:rPr>
@@ -330,7 +330,7 @@
       <w:pPr>
         <w:bidi/>
         <w:spacing w:after="120" w:before="0"/>
-        <w:jc w:val="right"/>
+        <w:jc w:val="both"/>
       </w:pPr>
       <w:r>
         <w:rPr>
@@ -344,7 +344,7 @@
       <w:pPr>
         <w:bidi/>
         <w:spacing w:after="120" w:before="0"/>
-        <w:jc w:val="right"/>
+        <w:jc w:val="both"/>
       </w:pPr>
       <w:r>
         <w:rPr>
@@ -381,7 +381,7 @@
       <w:pPr>
         <w:bidi/>
         <w:spacing w:after="120" w:before="0"/>
-        <w:jc w:val="right"/>
+        <w:jc w:val="both"/>
       </w:pPr>
       <w:r>
         <w:rPr>
@@ -5899,7 +5899,7 @@
       <w:pPr>
         <w:bidi/>
         <w:spacing w:after="120" w:before="0"/>
-        <w:jc w:val="right"/>
+        <w:jc w:val="both"/>
       </w:pPr>
       <w:r>
         <w:rPr>
@@ -5913,7 +5913,7 @@
       <w:pPr>
         <w:bidi/>
         <w:spacing w:after="120" w:before="0"/>
-        <w:jc w:val="right"/>
+        <w:jc w:val="both"/>
       </w:pPr>
       <w:r>
         <w:rPr>
@@ -5927,7 +5927,7 @@
       <w:pPr>
         <w:bidi/>
         <w:spacing w:after="120" w:before="0"/>
-        <w:jc w:val="right"/>
+        <w:jc w:val="both"/>
       </w:pPr>
       <w:r>
         <w:rPr>
@@ -5941,7 +5941,7 @@
       <w:pPr>
         <w:bidi/>
         <w:spacing w:after="120" w:before="0"/>
-        <w:jc w:val="right"/>
+        <w:jc w:val="both"/>
       </w:pPr>
       <w:r>
         <w:rPr>
@@ -5955,7 +5955,7 @@
       <w:pPr>
         <w:bidi/>
         <w:spacing w:after="120" w:before="0"/>
-        <w:jc w:val="right"/>
+        <w:jc w:val="both"/>
       </w:pPr>
       <w:r>
         <w:rPr>
@@ -5969,7 +5969,7 @@
       <w:pPr>
         <w:bidi/>
         <w:spacing w:after="120" w:before="0"/>
-        <w:jc w:val="right"/>
+        <w:jc w:val="both"/>
       </w:pPr>
       <w:r>
         <w:rPr>
@@ -5983,7 +5983,7 @@
       <w:pPr>
         <w:bidi/>
         <w:spacing w:after="120" w:before="0"/>
-        <w:jc w:val="right"/>
+        <w:jc w:val="both"/>
       </w:pPr>
       <w:r>
         <w:rPr>
@@ -5997,7 +5997,7 @@
       <w:pPr>
         <w:bidi/>
         <w:spacing w:after="120" w:before="0"/>
-        <w:jc w:val="right"/>
+        <w:jc w:val="both"/>
       </w:pPr>
       <w:r>
         <w:rPr>
@@ -6011,7 +6011,7 @@
       <w:pPr>
         <w:bidi/>
         <w:spacing w:after="120" w:before="0"/>
-        <w:jc w:val="right"/>
+        <w:jc w:val="both"/>
       </w:pPr>
       <w:r>
         <w:rPr>
@@ -6428,7 +6428,7 @@
       <w:pPr>
         <w:bidi/>
         <w:spacing w:after="60" w:before="0"/>
-        <w:jc w:val="right"/>
+        <w:jc w:val="both"/>
       </w:pPr>
       <w:r>
         <w:rPr>
@@ -9285,7 +9285,7 @@
       <w:pPr>
         <w:bidi/>
         <w:spacing w:after="120" w:before="0"/>
-        <w:jc w:val="right"/>
+        <w:jc w:val="both"/>
       </w:pPr>
       <w:r>
         <w:rPr>
@@ -9299,7 +9299,7 @@
       <w:pPr>
         <w:bidi/>
         <w:spacing w:after="120" w:before="0"/>
-        <w:jc w:val="right"/>
+        <w:jc w:val="both"/>
       </w:pPr>
       <w:r>
         <w:rPr>
@@ -9313,7 +9313,7 @@
       <w:pPr>
         <w:bidi/>
         <w:spacing w:after="120" w:before="0"/>
-        <w:jc w:val="right"/>
+        <w:jc w:val="both"/>
       </w:pPr>
       <w:r>
         <w:rPr>
@@ -9327,7 +9327,7 @@
       <w:pPr>
         <w:bidi/>
         <w:spacing w:after="120" w:before="0"/>
-        <w:jc w:val="right"/>
+        <w:jc w:val="both"/>
       </w:pPr>
       <w:r>
         <w:rPr>
@@ -9364,7 +9364,7 @@
       <w:pPr>
         <w:bidi/>
         <w:spacing w:after="120" w:before="0"/>
-        <w:jc w:val="right"/>
+        <w:jc w:val="both"/>
       </w:pPr>
       <w:r>
         <w:rPr>
@@ -9380,7 +9380,7 @@
       <w:pPr>
         <w:bidi/>
         <w:spacing w:after="100" w:before="0"/>
-        <w:jc w:val="right"/>
+        <w:jc w:val="both"/>
       </w:pPr>
       <w:r>
         <w:rPr>
@@ -10609,7 +10609,7 @@
       <w:pPr>
         <w:bidi/>
         <w:spacing w:after="120" w:before="80"/>
-        <w:jc w:val="right"/>
+        <w:jc w:val="both"/>
       </w:pPr>
       <w:r>
         <w:rPr>
@@ -12916,7 +12916,7 @@
       <w:pPr>
         <w:bidi/>
         <w:spacing w:after="120" w:before="80"/>
-        <w:jc w:val="right"/>
+        <w:jc w:val="both"/>
       </w:pPr>
       <w:r>
         <w:rPr>
@@ -14923,7 +14923,7 @@
       <w:pPr>
         <w:bidi/>
         <w:spacing w:after="120" w:before="80"/>
-        <w:jc w:val="right"/>
+        <w:jc w:val="both"/>
       </w:pPr>
       <w:r>
         <w:rPr>
@@ -17046,7 +17046,7 @@
       <w:pPr>
         <w:bidi/>
         <w:spacing w:after="120" w:before="80"/>
-        <w:jc w:val="right"/>
+        <w:jc w:val="both"/>
       </w:pPr>
       <w:r>
         <w:rPr>
@@ -19585,7 +19585,7 @@
       <w:pPr>
         <w:bidi/>
         <w:spacing w:after="120" w:before="80"/>
-        <w:jc w:val="right"/>
+        <w:jc w:val="both"/>
       </w:pPr>
       <w:r>
         <w:rPr>
@@ -19618,7 +19618,7 @@
       <w:pPr>
         <w:bidi/>
         <w:spacing w:after="120" w:before="0"/>
-        <w:jc w:val="right"/>
+        <w:jc w:val="both"/>
       </w:pPr>
       <w:r>
         <w:rPr>
@@ -19632,7 +19632,7 @@
       <w:pPr>
         <w:bidi/>
         <w:spacing w:after="120" w:before="0"/>
-        <w:jc w:val="right"/>
+        <w:jc w:val="both"/>
       </w:pPr>
       <w:r>
         <w:rPr>
@@ -19669,7 +19669,7 @@
       <w:pPr>
         <w:bidi/>
         <w:spacing w:after="120" w:before="0"/>
-        <w:jc w:val="right"/>
+        <w:jc w:val="both"/>
       </w:pPr>
       <w:r>
         <w:rPr>
@@ -19953,7 +19953,7 @@
       <w:pPr>
         <w:bidi/>
         <w:spacing w:after="120" w:before="160"/>
-        <w:jc w:val="right"/>
+        <w:jc w:val="both"/>
       </w:pPr>
       <w:r>
         <w:rPr>
@@ -19985,7 +19985,7 @@
       <w:pPr>
         <w:bidi/>
         <w:spacing w:after="120" w:before="0"/>
-        <w:jc w:val="right"/>
+        <w:jc w:val="both"/>
       </w:pPr>
       <w:r>
         <w:rPr>
@@ -20001,7 +20001,7 @@
       <w:pPr>
         <w:bidi/>
         <w:spacing w:after="120" w:before="0"/>
-        <w:jc w:val="right"/>
+        <w:jc w:val="both"/>
       </w:pPr>
       <w:r>
         <w:rPr>
@@ -20019,7 +20019,7 @@
       <w:pPr>
         <w:bidi/>
         <w:spacing w:after="120" w:before="0"/>
-        <w:jc w:val="right"/>
+        <w:jc w:val="both"/>
       </w:pPr>
       <w:r>
         <w:rPr>
@@ -20037,7 +20037,7 @@
       <w:pPr>
         <w:bidi/>
         <w:spacing w:after="40" w:before="0"/>
-        <w:jc w:val="right"/>
+        <w:jc w:val="both"/>
       </w:pPr>
       <w:r>
         <w:rPr>
@@ -20053,7 +20053,7 @@
       <w:pPr>
         <w:bidi/>
         <w:spacing w:after="40" w:before="0"/>
-        <w:jc w:val="right"/>
+        <w:jc w:val="both"/>
       </w:pPr>
       <w:r>
         <w:rPr>
@@ -20069,7 +20069,7 @@
       <w:pPr>
         <w:bidi/>
         <w:spacing w:after="40" w:before="0"/>
-        <w:jc w:val="right"/>
+        <w:jc w:val="both"/>
       </w:pPr>
       <w:r>
         <w:rPr>
@@ -20085,7 +20085,7 @@
       <w:pPr>
         <w:bidi/>
         <w:spacing w:after="40" w:before="0"/>
-        <w:jc w:val="right"/>
+        <w:jc w:val="both"/>
       </w:pPr>
       <w:r>
         <w:rPr>
@@ -20101,7 +20101,7 @@
       <w:pPr>
         <w:bidi/>
         <w:spacing w:after="40" w:before="0"/>
-        <w:jc w:val="right"/>
+        <w:jc w:val="both"/>
       </w:pPr>
       <w:r>
         <w:rPr>
@@ -20117,7 +20117,7 @@
       <w:pPr>
         <w:bidi/>
         <w:spacing w:after="120" w:before="0"/>
-        <w:jc w:val="right"/>
+        <w:jc w:val="both"/>
       </w:pPr>
       <w:r>
         <w:rPr>
@@ -20133,7 +20133,7 @@
       <w:pPr>
         <w:bidi/>
         <w:spacing w:after="120" w:before="0"/>
-        <w:jc w:val="right"/>
+        <w:jc w:val="both"/>
       </w:pPr>
       <w:r>
         <w:rPr>
@@ -21529,7 +21529,7 @@
       <w:pPr>
         <w:bidi/>
         <w:spacing w:after="120" w:before="120"/>
-        <w:jc w:val="right"/>
+        <w:jc w:val="both"/>
       </w:pPr>
       <w:r>
         <w:rPr>
@@ -21563,7 +21563,7 @@
       <w:pPr>
         <w:bidi/>
         <w:spacing w:after="120" w:before="0"/>
-        <w:jc w:val="right"/>
+        <w:jc w:val="both"/>
       </w:pPr>
       <w:r>
         <w:rPr>
@@ -21577,7 +21577,7 @@
       <w:pPr>
         <w:bidi/>
         <w:spacing w:after="120" w:before="0"/>
-        <w:jc w:val="right"/>
+        <w:jc w:val="both"/>
       </w:pPr>
       <w:r>
         <w:rPr>
@@ -21591,7 +21591,7 @@
       <w:pPr>
         <w:bidi/>
         <w:spacing w:after="120" w:before="0"/>
-        <w:jc w:val="right"/>
+        <w:jc w:val="both"/>
       </w:pPr>
       <w:r>
         <w:rPr>

</xml_diff>

<commit_message>
Reduce the lesson-plan file to a single lesson
The submission requires one lesson plan, so the file now carries only
lesson 1 (conversion) after the cover page; the decomposition lesson
remains described as lesson 3 in the intervention program table, and
cross-references in the mapping document were reworded to the
singular.

Co-Authored-By: Claude Fable 5 <noreply@anthropic.com>
Claude-Session: https://claude.ai/code/session_01EMxFUHHVvpa8bYzfYkV3bj
</commit_message>
<xml_diff>
--- a/lesson-plan/מיפוי-תוכנית-עבודה-וממצאים.docx
+++ b/lesson-plan/מיפוי-תוכנית-עבודה-וממצאים.docx
@@ -221,7 +221,7 @@
           <w:szCs w:val="20"/>
           <w:rtl/>
         </w:rPr>
-        <w:t xml:space="preserve">(פרטי התלמיד בדויים; מערכי השיעור מוגשים בקובץ נפרד)</w:t>
+        <w:t xml:space="preserve">(פרטי התלמיד בדויים; מערך השיעור מוגש בקובץ נפרד)</w:t>
       </w:r>
     </w:p>
     <w:p>
@@ -20375,7 +20375,7 @@
                 <w:szCs w:val="20"/>
                 <w:rtl/>
               </w:rPr>
-              <w:t xml:space="preserve">עבודה בדרג המוחשי (בדידי דיינס, מטבעות ב"בנק ההמרות") ומעבר מדורג לתמונתי ולסמלי. פתיחת טבלה מצטברת אישית שתלווה את כל התוכנית. השיעור מפורט בקובץ מערכי השיעור המצורף.</w:t>
+              <w:t xml:space="preserve">עבודה בדרג המוחשי (בדידי דיינס, מטבעות ב"בנק ההמרות") ומעבר מדורג לתמונתי ולסמלי. פתיחת טבלה מצטברת אישית שתלווה את כל התוכנית. שיעור 1 מפורט במלואו בקובץ מערך השיעור המצורף.</w:t>
             </w:r>
           </w:p>
         </w:tc>
@@ -20565,7 +20565,7 @@
                 <w:szCs w:val="20"/>
                 <w:rtl/>
               </w:rPr>
-              <w:t xml:space="preserve">הפעולה ההופכית להמרה: פריטת מוט עשרת ופריטת מטבע 10 ש"ח לתשלום סכום קטן. משחק "החלפות מהירות" המערבב המרה ופריטה. השיעור מפורט בקובץ מערכי השיעור המצורף.</w:t>
+              <w:t xml:space="preserve">הפעולה ההופכית להמרה: פריטת מוט עשרת ופריטת מטבע 10 ש"ח לתשלום סכום קטן. משחק "החלפות מהירות" המערבב המרה ופריטה.</w:t>
             </w:r>
           </w:p>
         </w:tc>
@@ -21538,7 +21538,7 @@
           <w:szCs w:val="22"/>
           <w:rtl/>
         </w:rPr>
-        <w:t xml:space="preserve">נספח לתוכנית: מערכי השיעורים המלאים (שיעור 1: המרה; שיעור 3: פריטה) מצורפים בקובץ מערך השיעור הנלווה. פרוטוקול הביצוע המלא של האבחון מופיע בסעיף ב' לעיל.</w:t>
+        <w:t xml:space="preserve">נספח לתוכנית: מערך השיעור המלא של שיעור 1 (המרה) מצורף בקובץ הנלווה. פרוטוקול הביצוע המלא של האבחון מופיע בסעיף ב' לעיל.</w:t>
       </w:r>
     </w:p>
     <w:p>

</xml_diff>